<commit_message>
Zakkaart: twijfel over een patient naar paradise-tbm@kuleuven.be; opleidingsoverzicht: inhaal droogloop Gent met dagdeel (vr 22 jan NM of do 28 jan VM), op een pagina
Co-Authored-By: Claude Opus 5.5 <noreply@anthropic.com>
</commit_message>
<xml_diff>
--- a/Educatie/PARADISE_opleidingsdata_centra.docx
+++ b/Educatie/PARADISE_opleidingsdata_centra.docx
@@ -102,7 +102,7 @@
         </w:tc>
         <w:tc>
           <w:tcPr>
-            <w:tcW w:type="dxa" w:w="2438"/>
+            <w:tcW w:type="dxa" w:w="1871"/>
             <w:shd w:val="clear" w:color="auto" w:fill="1D8DB0"/>
             <w:tcMar>
               <w:top w:w="28" w:type="dxa"/>
@@ -124,7 +124,7 @@
         </w:tc>
         <w:tc>
           <w:tcPr>
-            <w:tcW w:type="dxa" w:w="4025"/>
+            <w:tcW w:type="dxa" w:w="4592"/>
             <w:shd w:val="clear" w:color="auto" w:fill="1D8DB0"/>
             <w:tcMar>
               <w:top w:w="28" w:type="dxa"/>
@@ -182,7 +182,7 @@
         </w:tc>
         <w:tc>
           <w:tcPr>
-            <w:tcW w:type="dxa" w:w="2438"/>
+            <w:tcW w:type="dxa" w:w="1871"/>
             <w:tcMar>
               <w:top w:w="28" w:type="dxa"/>
               <w:bottom w:w="28" w:type="dxa"/>
@@ -220,7 +220,7 @@
         </w:tc>
         <w:tc>
           <w:tcPr>
-            <w:tcW w:type="dxa" w:w="4025"/>
+            <w:tcW w:type="dxa" w:w="4592"/>
             <w:tcMar>
               <w:top w:w="28" w:type="dxa"/>
               <w:bottom w:w="28" w:type="dxa"/>
@@ -285,7 +285,7 @@
         </w:tc>
         <w:tc>
           <w:tcPr>
-            <w:tcW w:type="dxa" w:w="2438"/>
+            <w:tcW w:type="dxa" w:w="1871"/>
             <w:tcMar>
               <w:top w:w="28" w:type="dxa"/>
               <w:bottom w:w="28" w:type="dxa"/>
@@ -323,7 +323,7 @@
         </w:tc>
         <w:tc>
           <w:tcPr>
-            <w:tcW w:type="dxa" w:w="4025"/>
+            <w:tcW w:type="dxa" w:w="4592"/>
             <w:tcMar>
               <w:top w:w="28" w:type="dxa"/>
               <w:bottom w:w="28" w:type="dxa"/>
@@ -379,7 +379,7 @@
         </w:tc>
         <w:tc>
           <w:tcPr>
-            <w:tcW w:type="dxa" w:w="2438"/>
+            <w:tcW w:type="dxa" w:w="1871"/>
             <w:tcMar>
               <w:top w:w="28" w:type="dxa"/>
               <w:bottom w:w="28" w:type="dxa"/>
@@ -417,7 +417,7 @@
         </w:tc>
         <w:tc>
           <w:tcPr>
-            <w:tcW w:type="dxa" w:w="4025"/>
+            <w:tcW w:type="dxa" w:w="4592"/>
             <w:tcMar>
               <w:top w:w="28" w:type="dxa"/>
               <w:bottom w:w="28" w:type="dxa"/>
@@ -528,7 +528,7 @@
         </w:tc>
         <w:tc>
           <w:tcPr>
-            <w:tcW w:type="dxa" w:w="2438"/>
+            <w:tcW w:type="dxa" w:w="1871"/>
             <w:tcMar>
               <w:top w:w="28" w:type="dxa"/>
               <w:bottom w:w="28" w:type="dxa"/>
@@ -566,7 +566,7 @@
         </w:tc>
         <w:tc>
           <w:tcPr>
-            <w:tcW w:type="dxa" w:w="4025"/>
+            <w:tcW w:type="dxa" w:w="4592"/>
             <w:tcMar>
               <w:top w:w="28" w:type="dxa"/>
               <w:bottom w:w="28" w:type="dxa"/>
@@ -631,7 +631,7 @@
         </w:tc>
         <w:tc>
           <w:tcPr>
-            <w:tcW w:type="dxa" w:w="2438"/>
+            <w:tcW w:type="dxa" w:w="1871"/>
             <w:tcMar>
               <w:top w:w="28" w:type="dxa"/>
               <w:bottom w:w="28" w:type="dxa"/>
@@ -669,7 +669,7 @@
         </w:tc>
         <w:tc>
           <w:tcPr>
-            <w:tcW w:type="dxa" w:w="4025"/>
+            <w:tcW w:type="dxa" w:w="4592"/>
             <w:tcMar>
               <w:top w:w="28" w:type="dxa"/>
               <w:bottom w:w="28" w:type="dxa"/>
@@ -753,7 +753,7 @@
         </w:tc>
         <w:tc>
           <w:tcPr>
-            <w:tcW w:type="dxa" w:w="2438"/>
+            <w:tcW w:type="dxa" w:w="1871"/>
             <w:tcMar>
               <w:top w:w="28" w:type="dxa"/>
               <w:bottom w:w="28" w:type="dxa"/>
@@ -809,7 +809,7 @@
         </w:tc>
         <w:tc>
           <w:tcPr>
-            <w:tcW w:type="dxa" w:w="4025"/>
+            <w:tcW w:type="dxa" w:w="4592"/>
             <w:tcMar>
               <w:top w:w="28" w:type="dxa"/>
               <w:bottom w:w="28" w:type="dxa"/>
@@ -957,7 +957,7 @@
         </w:tc>
         <w:tc>
           <w:tcPr>
-            <w:tcW w:type="dxa" w:w="2438"/>
+            <w:tcW w:type="dxa" w:w="1871"/>
             <w:tcMar>
               <w:top w:w="28" w:type="dxa"/>
               <w:bottom w:w="28" w:type="dxa"/>
@@ -995,7 +995,7 @@
         </w:tc>
         <w:tc>
           <w:tcPr>
-            <w:tcW w:type="dxa" w:w="4025"/>
+            <w:tcW w:type="dxa" w:w="4592"/>
             <w:tcMar>
               <w:top w:w="28" w:type="dxa"/>
               <w:bottom w:w="28" w:type="dxa"/>
@@ -1019,7 +1019,7 @@
                 <w:b w:val="0"/>
                 <w:sz w:val="17"/>
               </w:rPr>
-              <w:t>Brugge · wo 13 jan, NM (ma 18 jan, VM)</w:t>
+              <w:t>Brugge · wo 13 jan, NM (ma 18 jan VM)</w:t>
             </w:r>
           </w:p>
           <w:p>
@@ -1028,7 +1028,7 @@
                 <w:b w:val="0"/>
                 <w:sz w:val="17"/>
               </w:rPr>
-              <w:t>Aalst · di 19 jan (do 21 jan, NM)</w:t>
+              <w:t>Aalst · di 19 jan (do 21 jan NM)</w:t>
             </w:r>
           </w:p>
           <w:p>
@@ -1037,7 +1037,7 @@
                 <w:b w:val="0"/>
                 <w:sz w:val="17"/>
               </w:rPr>
-              <w:t>Kortrijk · wo 20 jan (ma 25 jan, NM)</w:t>
+              <w:t>Kortrijk · wo 20 jan (ma 25 jan NM)</w:t>
             </w:r>
           </w:p>
           <w:p>
@@ -1046,7 +1046,7 @@
                 <w:b w:val="0"/>
                 <w:sz w:val="17"/>
               </w:rPr>
-              <w:t>Gent · do 21 jan, 8u–12u30 (vr 22 of do 28 jan)</w:t>
+              <w:t>Gent · do 21 jan, 8u–12u30 (vr 22 jan NM of do 28 jan VM)</w:t>
             </w:r>
           </w:p>
           <w:p>
@@ -1055,7 +1055,7 @@
                 <w:b w:val="0"/>
                 <w:sz w:val="17"/>
               </w:rPr>
-              <w:t>Leuven · di 26 jan (vr 22 jan, VM)</w:t>
+              <w:t>Leuven · di 26 jan (vr 22 jan VM)</w:t>
             </w:r>
           </w:p>
           <w:p>
@@ -1064,7 +1064,7 @@
                 <w:b w:val="0"/>
                 <w:sz w:val="17"/>
               </w:rPr>
-              <w:t>Antwerpen · wo 27 jan, VM (do 28 jan, VM)</w:t>
+              <w:t>Antwerpen · wo 27 jan, VM (do 28 jan VM)</w:t>
             </w:r>
           </w:p>
         </w:tc>

</xml_diff>